<commit_message>
Corregir UML, prioridades y asignaciones sin personal disponible
</commit_message>
<xml_diff>
--- a/docs/informe/Informe_Dizeo_Progreso1.docx
+++ b/docs/informe/Informe_Dizeo_Progreso1.docx
@@ -499,7 +499,7 @@
         <w:pStyle w:val="DizeoTexto"/>
       </w:pPr>
       <w:r>
-        <w:t>El proyecto Dizeo aborda la organización de trabajadores y actividades en obras de construcción. El caso se delimita a 5 obras, 20 trabajadores, 100 actividades y 5 usuarios. La necesidad central consiste en coordinar qué trabajo debe atenderse primero y quién puede realizarlo dentro de un horario disponible. Una obra reúne actividades con fechas de entrega y especialidades diferentes; por ello, revisar cada tarea de forma aislada dificulta reconocer cómo se distribuye el personal entre los distintos frentes de trabajo.</w:t>
+        <w:t>El proyecto Dizeo aborda la organización de trabajadores y actividades en obras de construcción. De acuerdo con la información aportada por el equipo, las asignaciones se registran actualmente en Excel. Esto exige relacionar el registro de obras, actividades y trabajadores al decidir quién realiza cada tarea y en qué horario. Para este avance, el equipo delimita el alcance académico a 5 obras, 20 trabajadores, 100 actividades y 5 usuarios. Estas cantidades definen el caso que se analizará, sin establecer un límite técnico del sistema.</w:t>
       </w:r>
     </w:p>
     <w:p>
@@ -507,7 +507,7 @@
         <w:pStyle w:val="DizeoTexto"/>
       </w:pPr>
       <w:r>
-        <w:t>El problema aparece cuando la información sobre actividades pendientes, prioridades y disponibilidad no se considera de manera conjunta. Un trabajador puede ser seleccionado para dos tareas que coinciden en horario, mientras otra actividad permanece sin responsable. También puede atenderse una tarea menos urgente antes que otra próxima a vencer. Durdyev y Hosseini (2020) identifican la comunicación deficiente, la falta de coordinación y la planificación inadecuada entre las causas frecuentes de retrasos en construcción. Esta evidencia sustenta la importancia de estudiar la coordinación del trabajo en el contexto planteado.</w:t>
+        <w:t>La necesidad central consiste en determinar qué actividad debe atenderse primero y qué trabajador puede realizarla dentro de su jornada. Registrar asignaciones en una hoja de cálculo no asegura por sí solo que se revisen conjuntamente especialidad, prioridad y horarios. Un trabajador podría ser elegido para dos tareas superpuestas mientras otra permanece sin responsable. Durdyev y Hosseini (2020) identifican la comunicación deficiente, la falta de coordinación y la planificación inadecuada entre las causas frecuentes de retrasos en construcción. Esta evidencia sustenta estudiar esos riesgos en el caso planteado.</w:t>
       </w:r>
     </w:p>
     <w:p>
@@ -523,7 +523,7 @@
         <w:pStyle w:val="DizeoTexto"/>
       </w:pPr>
       <w:r>
-        <w:t>Las causas relevantes del problema son la dispersión de los datos, la ausencia de un criterio uniforme para decidir el orden de atención y la dificultad de revisar las asignaciones existentes antes de establecer un nuevo horario. Cuando varias obras comparten personal, los recursos disponibles limitan las decisiones de cada una. Gómez Sánchez et al. (2023) explican que la programación de múltiples proyectos debe considerar los recursos limitados al distribuir sus actividades. En este trabajo se estudia específicamente la relación entre especialidad, horario y prioridad para realizar esa distribución.</w:t>
+        <w:t>El análisis se concentra en la revisión conjunta de los datos que se registran en Excel y en la aplicación de un criterio uniforme para ordenar las tareas. La información disponible confirma el medio de registro, pero no documenta un incidente particular de Dizeo. Los cruces y las esperas se consideran riesgos del proceso, no sucesos empresariales demostrados. Gómez Sánchez et al. (2023) explican que varios proyectos deben distribuir recursos limitados. Esta relación sustenta examinar cómo se reparten las personas entre obras sin atribuir a la empresa frecuencias ni pérdidas económicas desconocidas.</w:t>
       </w:r>
     </w:p>
     <w:p>
@@ -581,7 +581,7 @@
         <w:pStyle w:val="DizeoCompacto"/>
       </w:pPr>
       <w:r>
-        <w:t>El proyecto comprende la organización de 5 obras, 20 trabajadores, 100 actividades y 5 usuarios. Los cinco módulos se concentran en buscar, filtrar, ordenar, priorizar, asignar y consultar avances.</w:t>
+        <w:t>El alcance académico comprende 5 obras, 20 trabajadores, 100 actividades y 5 usuarios. Los módulos se concentran en buscar, filtrar, ordenar, priorizar, asignar y consultar avances.</w:t>
       </w:r>
     </w:p>
     <w:p>
@@ -933,7 +933,7 @@
         <w:t>Reglas:</w:t>
       </w:r>
       <w:r>
-        <w:t xml:space="preserve"> Prioridad 1 = alta, 2 = media y 3 = baja. Solo las actividades pendientes y sin asignación activa permanecen en la cola.</w:t>
+        <w:t xml:space="preserve"> Prioridad 1 = alta, 2 = media y 3 = baja. Solo las pendientes sin asignación activa están en la cola. GestorPrioridades controla sus cambios; una actividad sin personal disponible permanece pendiente.</w:t>
       </w:r>
     </w:p>
     <w:p>
@@ -1020,7 +1020,7 @@
         <w:pStyle w:val="DizeoCompacto"/>
       </w:pPr>
       <w:r>
-        <w:t>1. Consultar trabajadores compatibles y disponibles para una actividad.</w:t>
+        <w:t>1. Consultar candidatos para la actividad prioritaria y, si no hay personal, otras pendientes por decisión del supervisor.</w:t>
       </w:r>
     </w:p>
     <w:p>
@@ -1058,7 +1058,7 @@
         <w:t>Reglas:</w:t>
       </w:r>
       <w:r>
-        <w:t xml:space="preserve"> El fin debe ser posterior al inicio. Una actividad tiene como máximo una asignación activa. La prioridad no permite ignorar la jornada ni los cruces de horario.</w:t>
+        <w:t xml:space="preserve"> El fin debe ser posterior al inicio. Una actividad tiene como máximo una asignación activa. Consultar alternativas no elimina pendientes. Confirmar exige especialidad, jornada y ausencia de cruces; solo entonces se retira la actividad seleccionada de la cola.</w:t>
       </w:r>
     </w:p>
     <w:p>
@@ -1188,7 +1188,7 @@
         <w:t>Reglas:</w:t>
       </w:r>
       <w:r>
-        <w:t xml:space="preserve"> El avance está entre 0 y 100 %. Una actividad terminada tiene 100 %. Una obra sin actividades tiene avance 0 %.</w:t>
+        <w:t xml:space="preserve"> El avance está entre 0 y 100 %. Una actividad terminada tiene 100 %. El avance de obra es el promedio simple: todas las actividades pesan igual. Una obra sin actividades tiene avance 0 %.</w:t>
       </w:r>
     </w:p>
     <w:p>
@@ -1217,6 +1217,213 @@
       </w:r>
       <w:r>
         <w:t xml:space="preserve"> Daniel Valarezo.</w:t>
+      </w:r>
+    </w:p>
+    <w:p>
+      <w:pPr>
+        <w:pStyle w:val="DizeoSeccion"/>
+        <w:pageBreakBefore w:val="0"/>
+        <w:spacing w:before="160" w:after="240"/>
+        <w:jc w:val="center"/>
+        <w:shd w:fill="C6D9F1"/>
+        <w:pBdr>
+          <w:top w:val="single" w:sz="4" w:space="4" w:color="000000"/>
+          <w:left w:val="single" w:sz="4" w:space="4" w:color="000000"/>
+          <w:bottom w:val="single" w:sz="4" w:space="4" w:color="000000"/>
+          <w:right w:val="single" w:sz="4" w:space="4" w:color="000000"/>
+        </w:pBdr>
+      </w:pPr>
+      <w:r>
+        <w:t>3. MODELO ORIENTADO A OBJETOS Y UML PRELIMINAR</w:t>
+      </w:r>
+    </w:p>
+    <w:p>
+      <w:pPr>
+        <w:pStyle w:val="DizeoCompacto"/>
+      </w:pPr>
+      <w:r>
+        <w:t>El modelo contiene cinco clases de dominio: Obra, Actividad, Trabajador, Asignacion y Usuario. Obra compone sus actividades; las asignaciones relacionan una actividad, un trabajador y el usuario que las registra. No se incorpora herencia artificial.</w:t>
+      </w:r>
+    </w:p>
+    <w:p>
+      <w:pPr>
+        <w:pStyle w:val="DizeoCompacto"/>
+      </w:pPr>
+      <w:r>
+        <w:t>GestorPrioridades es un servicio de M3, utilizado también por M4 para sincronizar la cola con las asignaciones. Se distingue de las entidades del negocio y controla los cambios de prioridad. Los símbolos +, - y ~ indican visibilidad pública, privada y de paquete, respectivamente.</w:t>
+      </w:r>
+    </w:p>
+    <w:p>
+      <w:r>
+        <w:br w:type="page"/>
+      </w:r>
+    </w:p>
+    <w:p>
+      <w:pPr>
+        <w:pStyle w:val="DizeoSubtitulo"/>
+        <w:spacing w:before="200" w:after="160"/>
+      </w:pPr>
+      <w:r>
+        <w:t>Clases de dominio y multiplicidades</w:t>
+      </w:r>
+    </w:p>
+    <w:p>
+      <w:pPr>
+        <w:keepNext/>
+        <w:jc w:val="center"/>
+      </w:pPr>
+      <w:r>
+        <w:drawing>
+          <wp:inline xmlns:a="http://schemas.openxmlformats.org/drawingml/2006/main" xmlns:pic="http://schemas.openxmlformats.org/drawingml/2006/picture">
+            <wp:extent cx="5074920" cy="6551260"/>
+            <wp:docPr id="1" name="Picture 1"/>
+            <wp:cNvGraphicFramePr>
+              <a:graphicFrameLocks noChangeAspect="1"/>
+            </wp:cNvGraphicFramePr>
+            <a:graphic>
+              <a:graphicData uri="http://schemas.openxmlformats.org/drawingml/2006/picture">
+                <pic:pic>
+                  <pic:nvPicPr>
+                    <pic:cNvPr id="0" name="uml_dominio.png"/>
+                    <pic:cNvPicPr/>
+                  </pic:nvPicPr>
+                  <pic:blipFill>
+                    <a:blip r:embed="rId21"/>
+                    <a:stretch>
+                      <a:fillRect/>
+                    </a:stretch>
+                  </pic:blipFill>
+                  <pic:spPr>
+                    <a:xfrm>
+                      <a:off x="0" y="0"/>
+                      <a:ext cx="5074920" cy="6551260"/>
+                    </a:xfrm>
+                    <a:prstGeom prst="rect"/>
+                  </pic:spPr>
+                </pic:pic>
+              </a:graphicData>
+            </a:graphic>
+          </wp:inline>
+        </w:drawing>
+      </w:r>
+    </w:p>
+    <w:p>
+      <w:pPr>
+        <w:pStyle w:val="DizeoCompacto"/>
+      </w:pPr>
+      <w:r>
+        <w:t>Figura 1. UML del dominio. Cada multiplicidad se sitúa junto a su extremo. Fuente: elaboración propia.</w:t>
+      </w:r>
+    </w:p>
+    <w:p>
+      <w:r>
+        <w:br w:type="page"/>
+      </w:r>
+    </w:p>
+    <w:p>
+      <w:pPr>
+        <w:pStyle w:val="DizeoSubtitulo"/>
+        <w:spacing w:before="200" w:after="160"/>
+      </w:pPr>
+      <w:r>
+        <w:t>Servicio que administra las prioridades</w:t>
+      </w:r>
+    </w:p>
+    <w:p>
+      <w:pPr>
+        <w:keepNext/>
+        <w:jc w:val="center"/>
+      </w:pPr>
+      <w:r>
+        <w:drawing>
+          <wp:inline xmlns:a="http://schemas.openxmlformats.org/drawingml/2006/main" xmlns:pic="http://schemas.openxmlformats.org/drawingml/2006/picture">
+            <wp:extent cx="5212080" cy="2004646"/>
+            <wp:docPr id="2" name="Picture 2"/>
+            <wp:cNvGraphicFramePr>
+              <a:graphicFrameLocks noChangeAspect="1"/>
+            </wp:cNvGraphicFramePr>
+            <a:graphic>
+              <a:graphicData uri="http://schemas.openxmlformats.org/drawingml/2006/picture">
+                <pic:pic>
+                  <pic:nvPicPr>
+                    <pic:cNvPr id="0" name="uml_servicio.png"/>
+                    <pic:cNvPicPr/>
+                  </pic:nvPicPr>
+                  <pic:blipFill>
+                    <a:blip r:embed="rId22"/>
+                    <a:stretch>
+                      <a:fillRect/>
+                    </a:stretch>
+                  </pic:blipFill>
+                  <pic:spPr>
+                    <a:xfrm>
+                      <a:off x="0" y="0"/>
+                      <a:ext cx="5212080" cy="2004646"/>
+                    </a:xfrm>
+                    <a:prstGeom prst="rect"/>
+                  </pic:spPr>
+                </pic:pic>
+              </a:graphicData>
+            </a:graphic>
+          </wp:inline>
+        </w:drawing>
+      </w:r>
+    </w:p>
+    <w:p>
+      <w:pPr>
+        <w:pStyle w:val="DizeoCompacto"/>
+      </w:pPr>
+      <w:r>
+        <w:t>Figura 2. GestorPrioridades y su dependencia de Actividad. Fuente: elaboración propia.</w:t>
+      </w:r>
+    </w:p>
+    <w:p>
+      <w:pPr>
+        <w:pStyle w:val="DizeoCompacto"/>
+      </w:pPr>
+      <w:r>
+        <w:t>GestorPrioridades conserva la cola y el comparador por prioridad, fecha límite y código. consultarProxima() devuelve la cabecera sin retirarla; listarEnOrden() devuelve una copia ordenada. Si no hay pendientes, la primera devuelve null y la segunda una lista vacía.</w:t>
+      </w:r>
+    </w:p>
+    <w:p>
+      <w:pPr>
+        <w:pStyle w:val="DizeoCompacto"/>
+      </w:pPr>
+      <w:r>
+        <w:t>cambiarPrioridad(codigo, valor) valida el rango 1–3, localiza la actividad y, si está en la cola, la retira antes de cambiar su clave y la reinserta. La operación Actividad.cambiarPrioridad tiene visibilidad de paquete y se invoca únicamente desde este servicio. Así se evita modificar una clave mientras el objeto continúa dentro del heap. retirarAsignada(codigo) se usa después de validar y confirmar la asignación: aplica poll() si coincide con la cabecera y remove(objeto) si se eligió otra pendiente.</w:t>
+      </w:r>
+    </w:p>
+    <w:p>
+      <w:pPr>
+        <w:pStyle w:val="DizeoSubtitulo"/>
+        <w:spacing w:before="200" w:after="160"/>
+      </w:pPr>
+      <w:r>
+        <w:t>Relaciones y correspondencia con los módulos</w:t>
+      </w:r>
+    </w:p>
+    <w:p>
+      <w:pPr>
+        <w:pStyle w:val="DizeoCompacto"/>
+      </w:pPr>
+      <w:r>
+        <w:t>Una obra contiene 0..* actividades y cada actividad pertenece a 1 obra. Cada asignación corresponde a 1 actividad, 1 trabajador y 1 usuario; cada uno puede relacionarse con 0..* asignaciones. Como máximo una asignación está activa por actividad y los horarios activos de un trabajador no se superponen.</w:t>
+      </w:r>
+    </w:p>
+    <w:p>
+      <w:pPr>
+        <w:pStyle w:val="DizeoCompacto"/>
+      </w:pPr>
+      <w:r>
+        <w:t>Obra corresponde a M1; Trabajador, a M2; Actividad y GestorPrioridades, a M3; Asignacion, a M4; y los avances de Actividad y Obra, a M5. Usuario identifica al operador. El promedio de avance usa el mismo peso para cada actividad, aunque difieran en tamaño; mide progreso por actividad, no esfuerzo ejecutado.</w:t>
+      </w:r>
+    </w:p>
+    <w:p>
+      <w:pPr>
+        <w:pStyle w:val="DizeoCompacto"/>
+      </w:pPr>
+      <w:r>
+        <w:t>El archivo docs/uml/dizeo.drawio contiene las dos vistas editables. Julián Jiménez confirmó que los tres integrantes realizaron la revisión del informe y del UML; el registro se conserva en docs/uml/REVISION.md.</w:t>
       </w:r>
     </w:p>
     <w:p>
@@ -1234,7 +1441,7 @@
         </w:pBdr>
       </w:pPr>
       <w:r>
-        <w:t>3. MODELO ORIENTADO A OBJETOS Y UML PRELIMINAR</w:t>
+        <w:t>4. ALTERNATIVAS DE ESTRUCTURAS Y ALGORITMOS</w:t>
       </w:r>
     </w:p>
     <w:p>
@@ -1242,447 +1449,7 @@
         <w:pStyle w:val="DizeoCompacto"/>
       </w:pPr>
       <w:r>
-        <w:t>El modelo utiliza cinco clases de dominio: Obra, Actividad, Trabajador, Asignacion y Usuario. Obra contiene sus actividades mediante composición. Las demás relaciones se representan como asociaciones; no se incorpora herencia porque el caso no requiere una jerarquía de clases.</w:t>
-      </w:r>
-    </w:p>
-    <w:p>
-      <w:pPr>
-        <w:keepNext/>
-        <w:jc w:val="center"/>
-      </w:pPr>
-      <w:r>
-        <w:drawing>
-          <wp:inline xmlns:a="http://schemas.openxmlformats.org/drawingml/2006/main" xmlns:pic="http://schemas.openxmlformats.org/drawingml/2006/picture">
-            <wp:extent cx="5212080" cy="5401610"/>
-            <wp:docPr id="1" name="Picture 1"/>
-            <wp:cNvGraphicFramePr>
-              <a:graphicFrameLocks noChangeAspect="1"/>
-            </wp:cNvGraphicFramePr>
-            <a:graphic>
-              <a:graphicData uri="http://schemas.openxmlformats.org/drawingml/2006/picture">
-                <pic:pic>
-                  <pic:nvPicPr>
-                    <pic:cNvPr id="0" name="uml.png"/>
-                    <pic:cNvPicPr/>
-                  </pic:nvPicPr>
-                  <pic:blipFill>
-                    <a:blip r:embed="rId21"/>
-                    <a:stretch>
-                      <a:fillRect/>
-                    </a:stretch>
-                  </pic:blipFill>
-                  <pic:spPr>
-                    <a:xfrm>
-                      <a:off x="0" y="0"/>
-                      <a:ext cx="5212080" cy="5401610"/>
-                    </a:xfrm>
-                    <a:prstGeom prst="rect"/>
-                  </pic:spPr>
-                </pic:pic>
-              </a:graphicData>
-            </a:graphic>
-          </wp:inline>
-        </w:drawing>
-      </w:r>
-    </w:p>
-    <w:p>
-      <w:pPr>
-        <w:pStyle w:val="DizeoCompacto"/>
-      </w:pPr>
-      <w:r>
-        <w:t>Figura 1. Clases, atributos, métodos y multiplicidades de la solución propuesta. Fuente: elaboración propia.</w:t>
-      </w:r>
-    </w:p>
-    <w:p>
-      <w:r>
-        <w:br w:type="page"/>
-      </w:r>
-    </w:p>
-    <w:p>
-      <w:pPr>
-        <w:pStyle w:val="DizeoSubtitulo"/>
-        <w:spacing w:before="200" w:after="160"/>
-      </w:pPr>
-      <w:r>
-        <w:t>Relaciones y correspondencia con los módulos</w:t>
-      </w:r>
-    </w:p>
-    <w:tbl>
-      <w:tblPr>
-        <w:tblW w:type="auto" w:w="0"/>
-        <w:jc w:val="center"/>
-        <w:tblLayout w:type="fixed"/>
-        <w:tblLook w:firstColumn="1" w:firstRow="1" w:lastColumn="0" w:lastRow="0" w:noHBand="0" w:noVBand="1" w:val="04A0"/>
-        <w:tblBorders>
-          <w:top w:val="single" w:sz="4" w:color="000000"/>
-          <w:left w:val="single" w:sz="4" w:color="000000"/>
-          <w:bottom w:val="single" w:sz="4" w:color="000000"/>
-          <w:right w:val="single" w:sz="4" w:color="000000"/>
-          <w:insideH w:val="single" w:sz="4" w:color="000000"/>
-          <w:insideV w:val="single" w:sz="4" w:color="000000"/>
-        </w:tblBorders>
-      </w:tblPr>
-      <w:tblGrid>
-        <w:gridCol w:w="2160"/>
-        <w:gridCol w:w="6048"/>
-      </w:tblGrid>
-      <w:tr>
-        <w:trPr>
-          <w:cantSplit/>
-          <w:tblHeader/>
-        </w:trPr>
-        <w:tc>
-          <w:tcPr>
-            <w:tcW w:type="dxa" w:w="2160"/>
-            <w:vAlign w:val="center"/>
-            <w:shd w:fill="747474"/>
-            <w:tcMar>
-              <w:top w:w="85" w:type="dxa"/>
-              <w:left w:w="85" w:type="dxa"/>
-              <w:bottom w:w="85" w:type="dxa"/>
-              <w:right w:w="85" w:type="dxa"/>
-            </w:tcMar>
-          </w:tcPr>
-          <w:p>
-            <w:pPr>
-              <w:pStyle w:val="DizeoCompacto"/>
-              <w:spacing w:after="60" w:before="40"/>
-              <w:jc w:val="center"/>
-            </w:pPr>
-            <w:r>
-              <w:rPr>
-                <w:rFonts w:ascii="Calibri" w:hAnsi="Calibri"/>
-                <w:b/>
-                <w:color w:val="FFFFFF"/>
-                <w:sz w:val="22"/>
-              </w:rPr>
-              <w:t>Relación</w:t>
-            </w:r>
-          </w:p>
-        </w:tc>
-        <w:tc>
-          <w:tcPr>
-            <w:tcW w:type="dxa" w:w="6048"/>
-            <w:vAlign w:val="center"/>
-            <w:shd w:fill="747474"/>
-            <w:tcMar>
-              <w:top w:w="85" w:type="dxa"/>
-              <w:left w:w="85" w:type="dxa"/>
-              <w:bottom w:w="85" w:type="dxa"/>
-              <w:right w:w="85" w:type="dxa"/>
-            </w:tcMar>
-          </w:tcPr>
-          <w:p>
-            <w:pPr>
-              <w:pStyle w:val="DizeoCompacto"/>
-              <w:spacing w:after="60" w:before="40"/>
-              <w:jc w:val="center"/>
-            </w:pPr>
-            <w:r>
-              <w:rPr>
-                <w:rFonts w:ascii="Calibri" w:hAnsi="Calibri"/>
-                <w:b/>
-                <w:color w:val="FFFFFF"/>
-                <w:sz w:val="22"/>
-              </w:rPr>
-              <w:t>Multiplicidad y significado</w:t>
-            </w:r>
-          </w:p>
-        </w:tc>
-      </w:tr>
-      <w:tr>
-        <w:trPr>
-          <w:cantSplit/>
-        </w:trPr>
-        <w:tc>
-          <w:tcPr>
-            <w:tcW w:type="dxa" w:w="2160"/>
-            <w:vAlign w:val="center"/>
-            <w:shd w:fill="FFFFFF"/>
-            <w:tcMar>
-              <w:top w:w="85" w:type="dxa"/>
-              <w:left w:w="85" w:type="dxa"/>
-              <w:bottom w:w="85" w:type="dxa"/>
-              <w:right w:w="85" w:type="dxa"/>
-            </w:tcMar>
-          </w:tcPr>
-          <w:p>
-            <w:pPr>
-              <w:pStyle w:val="DizeoCompacto"/>
-              <w:spacing w:after="60" w:before="40"/>
-              <w:jc w:val="left"/>
-            </w:pPr>
-            <w:r>
-              <w:rPr>
-                <w:rFonts w:ascii="Calibri" w:hAnsi="Calibri"/>
-                <w:b w:val="0"/>
-                <w:color w:val="000000"/>
-                <w:sz w:val="22"/>
-              </w:rPr>
-              <w:t>Obra–Actividad</w:t>
-            </w:r>
-          </w:p>
-        </w:tc>
-        <w:tc>
-          <w:tcPr>
-            <w:tcW w:type="dxa" w:w="6048"/>
-            <w:vAlign w:val="center"/>
-            <w:shd w:fill="FFFFFF"/>
-            <w:tcMar>
-              <w:top w:w="85" w:type="dxa"/>
-              <w:left w:w="85" w:type="dxa"/>
-              <w:bottom w:w="85" w:type="dxa"/>
-              <w:right w:w="85" w:type="dxa"/>
-            </w:tcMar>
-          </w:tcPr>
-          <w:p>
-            <w:pPr>
-              <w:pStyle w:val="DizeoCompacto"/>
-              <w:spacing w:after="60" w:before="40"/>
-              <w:jc w:val="left"/>
-            </w:pPr>
-            <w:r>
-              <w:rPr>
-                <w:rFonts w:ascii="Calibri" w:hAnsi="Calibri"/>
-                <w:b w:val="0"/>
-                <w:color w:val="000000"/>
-                <w:sz w:val="22"/>
-              </w:rPr>
-              <w:t>Una obra contiene 0..* actividades; cada actividad pertenece a 1 obra. La composición representa esa pertenencia.</w:t>
-            </w:r>
-          </w:p>
-        </w:tc>
-      </w:tr>
-      <w:tr>
-        <w:trPr>
-          <w:cantSplit/>
-        </w:trPr>
-        <w:tc>
-          <w:tcPr>
-            <w:tcW w:type="dxa" w:w="2160"/>
-            <w:vAlign w:val="center"/>
-            <w:shd w:fill="FFFFFF"/>
-            <w:tcMar>
-              <w:top w:w="85" w:type="dxa"/>
-              <w:left w:w="85" w:type="dxa"/>
-              <w:bottom w:w="85" w:type="dxa"/>
-              <w:right w:w="85" w:type="dxa"/>
-            </w:tcMar>
-          </w:tcPr>
-          <w:p>
-            <w:pPr>
-              <w:pStyle w:val="DizeoCompacto"/>
-              <w:spacing w:after="60" w:before="40"/>
-              <w:jc w:val="left"/>
-            </w:pPr>
-            <w:r>
-              <w:rPr>
-                <w:rFonts w:ascii="Calibri" w:hAnsi="Calibri"/>
-                <w:b w:val="0"/>
-                <w:color w:val="000000"/>
-                <w:sz w:val="22"/>
-              </w:rPr>
-              <w:t>Actividad–Asignacion</w:t>
-            </w:r>
-          </w:p>
-        </w:tc>
-        <w:tc>
-          <w:tcPr>
-            <w:tcW w:type="dxa" w:w="6048"/>
-            <w:vAlign w:val="center"/>
-            <w:shd w:fill="FFFFFF"/>
-            <w:tcMar>
-              <w:top w:w="85" w:type="dxa"/>
-              <w:left w:w="85" w:type="dxa"/>
-              <w:bottom w:w="85" w:type="dxa"/>
-              <w:right w:w="85" w:type="dxa"/>
-            </w:tcMar>
-          </w:tcPr>
-          <w:p>
-            <w:pPr>
-              <w:pStyle w:val="DizeoCompacto"/>
-              <w:spacing w:after="60" w:before="40"/>
-              <w:jc w:val="left"/>
-            </w:pPr>
-            <w:r>
-              <w:rPr>
-                <w:rFonts w:ascii="Calibri" w:hAnsi="Calibri"/>
-                <w:b w:val="0"/>
-                <w:color w:val="000000"/>
-                <w:sz w:val="22"/>
-              </w:rPr>
-              <w:t>Una actividad conserva 0..* asignaciones, con un máximo de una activa. Cada asignación corresponde a 1 actividad.</w:t>
-            </w:r>
-          </w:p>
-        </w:tc>
-      </w:tr>
-      <w:tr>
-        <w:trPr>
-          <w:cantSplit/>
-        </w:trPr>
-        <w:tc>
-          <w:tcPr>
-            <w:tcW w:type="dxa" w:w="2160"/>
-            <w:vAlign w:val="center"/>
-            <w:shd w:fill="FFFFFF"/>
-            <w:tcMar>
-              <w:top w:w="85" w:type="dxa"/>
-              <w:left w:w="85" w:type="dxa"/>
-              <w:bottom w:w="85" w:type="dxa"/>
-              <w:right w:w="85" w:type="dxa"/>
-            </w:tcMar>
-          </w:tcPr>
-          <w:p>
-            <w:pPr>
-              <w:pStyle w:val="DizeoCompacto"/>
-              <w:spacing w:after="60" w:before="40"/>
-              <w:jc w:val="left"/>
-            </w:pPr>
-            <w:r>
-              <w:rPr>
-                <w:rFonts w:ascii="Calibri" w:hAnsi="Calibri"/>
-                <w:b w:val="0"/>
-                <w:color w:val="000000"/>
-                <w:sz w:val="22"/>
-              </w:rPr>
-              <w:t>Trabajador–Asignacion</w:t>
-            </w:r>
-          </w:p>
-        </w:tc>
-        <w:tc>
-          <w:tcPr>
-            <w:tcW w:type="dxa" w:w="6048"/>
-            <w:vAlign w:val="center"/>
-            <w:shd w:fill="FFFFFF"/>
-            <w:tcMar>
-              <w:top w:w="85" w:type="dxa"/>
-              <w:left w:w="85" w:type="dxa"/>
-              <w:bottom w:w="85" w:type="dxa"/>
-              <w:right w:w="85" w:type="dxa"/>
-            </w:tcMar>
-          </w:tcPr>
-          <w:p>
-            <w:pPr>
-              <w:pStyle w:val="DizeoCompacto"/>
-              <w:spacing w:after="60" w:before="40"/>
-              <w:jc w:val="left"/>
-            </w:pPr>
-            <w:r>
-              <w:rPr>
-                <w:rFonts w:ascii="Calibri" w:hAnsi="Calibri"/>
-                <w:b w:val="0"/>
-                <w:color w:val="000000"/>
-                <w:sz w:val="22"/>
-              </w:rPr>
-              <w:t>Un trabajador puede tener 0..* asignaciones en horarios compatibles. Cada asignación corresponde a 1 trabajador.</w:t>
-            </w:r>
-          </w:p>
-        </w:tc>
-      </w:tr>
-      <w:tr>
-        <w:trPr>
-          <w:cantSplit/>
-        </w:trPr>
-        <w:tc>
-          <w:tcPr>
-            <w:tcW w:type="dxa" w:w="2160"/>
-            <w:vAlign w:val="center"/>
-            <w:shd w:fill="FFFFFF"/>
-            <w:tcMar>
-              <w:top w:w="85" w:type="dxa"/>
-              <w:left w:w="85" w:type="dxa"/>
-              <w:bottom w:w="85" w:type="dxa"/>
-              <w:right w:w="85" w:type="dxa"/>
-            </w:tcMar>
-          </w:tcPr>
-          <w:p>
-            <w:pPr>
-              <w:pStyle w:val="DizeoCompacto"/>
-              <w:spacing w:after="60" w:before="40"/>
-              <w:jc w:val="left"/>
-            </w:pPr>
-            <w:r>
-              <w:rPr>
-                <w:rFonts w:ascii="Calibri" w:hAnsi="Calibri"/>
-                <w:b w:val="0"/>
-                <w:color w:val="000000"/>
-                <w:sz w:val="22"/>
-              </w:rPr>
-              <w:t>Usuario–Asignacion</w:t>
-            </w:r>
-          </w:p>
-        </w:tc>
-        <w:tc>
-          <w:tcPr>
-            <w:tcW w:type="dxa" w:w="6048"/>
-            <w:vAlign w:val="center"/>
-            <w:shd w:fill="FFFFFF"/>
-            <w:tcMar>
-              <w:top w:w="85" w:type="dxa"/>
-              <w:left w:w="85" w:type="dxa"/>
-              <w:bottom w:w="85" w:type="dxa"/>
-              <w:right w:w="85" w:type="dxa"/>
-            </w:tcMar>
-          </w:tcPr>
-          <w:p>
-            <w:pPr>
-              <w:pStyle w:val="DizeoCompacto"/>
-              <w:spacing w:after="60" w:before="40"/>
-              <w:jc w:val="left"/>
-            </w:pPr>
-            <w:r>
-              <w:rPr>
-                <w:rFonts w:ascii="Calibri" w:hAnsi="Calibri"/>
-                <w:b w:val="0"/>
-                <w:color w:val="000000"/>
-                <w:sz w:val="22"/>
-              </w:rPr>
-              <w:t>Un usuario registra 0..* asignaciones. Cada asignación tiene 1 usuario responsable.</w:t>
-            </w:r>
-          </w:p>
-        </w:tc>
-      </w:tr>
-    </w:tbl>
-    <w:p>
-      <w:pPr>
-        <w:pStyle w:val="DizeoCompacto"/>
-      </w:pPr>
-      <w:r>
-        <w:t>Obra corresponde a M1; Trabajador, a M2; Actividad, a M3 y M5; Asignacion, a M4; y Usuario identifica a quien registra la asignación. El avance se conserva en Actividad y el avance de Obra se calcula a partir de sus actividades.</w:t>
-      </w:r>
-    </w:p>
-    <w:p>
-      <w:pPr>
-        <w:pStyle w:val="DizeoCompacto"/>
-      </w:pPr>
-      <w:r>
-        <w:t>El diagrama editable se encuentra en docs/uml/dizeo.drawio. La revisión del equipo debe comprobar las clases, los métodos y las multiplicidades antes de la entrega.</w:t>
-      </w:r>
-    </w:p>
-    <w:p>
-      <w:pPr>
-        <w:pStyle w:val="DizeoSeccion"/>
-        <w:pageBreakBefore/>
-        <w:spacing w:before="160" w:after="240"/>
-        <w:jc w:val="center"/>
-        <w:shd w:fill="C6D9F1"/>
-        <w:pBdr>
-          <w:top w:val="single" w:sz="4" w:space="4" w:color="000000"/>
-          <w:left w:val="single" w:sz="4" w:space="4" w:color="000000"/>
-          <w:bottom w:val="single" w:sz="4" w:space="4" w:color="000000"/>
-          <w:right w:val="single" w:sz="4" w:space="4" w:color="000000"/>
-        </w:pBdr>
-      </w:pPr>
-      <w:r>
-        <w:t>4. ALTERNATIVAS DE ESTRUCTURAS Y ALGORITMOS</w:t>
-      </w:r>
-    </w:p>
-    <w:p>
-      <w:pPr>
-        <w:pStyle w:val="DizeoCompacto"/>
-      </w:pPr>
-      <w:r>
-        <w:t>Se comparan dos formas de buscar entidades y seleccionar la próxima actividad pendiente. Las dos aplican el mismo criterio: prioridad alta, media y baja; después, fecha límite más próxima y código menor. La validación de horarios se conserva en ambas.</w:t>
+        <w:t>Se comparan dos formas de buscar entidades y ordenar actividades pendientes. Ambas usan prioridad alta, media y baja, fecha límite más próxima y código menor. La verificación de especialidad y horario se conserva en las dos.</w:t>
       </w:r>
     </w:p>
     <w:tbl>
@@ -1915,7 +1682,7 @@
                 <w:color w:val="000000"/>
                 <w:sz w:val="22"/>
               </w:rPr>
-              <w:t>Búsqueda lineal por código; recorrido para elegir la próxima actividad; ordenamiento por comparador para listar prioridades.</w:t>
+              <w:t>Búsqueda lineal; recorrido para elegir la próxima; copia ordenada con comparador para consultar alternativas.</w:t>
             </w:r>
           </w:p>
         </w:tc>
@@ -1944,7 +1711,7 @@
                 <w:color w:val="000000"/>
                 <w:sz w:val="22"/>
               </w:rPr>
-              <w:t>Es sencilla de implementar. Las búsquedas y la extracción de la próxima actividad recorren la colección.</w:t>
+              <w:t>Implementación sencilla. Las búsquedas y la selección de la próxima recorren las pendientes.</w:t>
             </w:r>
           </w:p>
         </w:tc>
@@ -2036,7 +1803,7 @@
                 <w:color w:val="000000"/>
                 <w:sz w:val="22"/>
               </w:rPr>
-              <w:t>Consulta por clave; offer, peek y poll con comparador de prioridad, fecha y código; recorrido para validar horarios.</w:t>
+              <w:t>Consulta por clave; peek y poll; copia ordenada para alternativas; remove(objeto) si se selecciona una actividad distinta de la cabecera.</w:t>
             </w:r>
           </w:p>
         </w:tc>
@@ -2065,7 +1832,7 @@
                 <w:color w:val="000000"/>
                 <w:sz w:val="22"/>
               </w:rPr>
-              <w:t>Favorece búsquedas y selección repetida. Requiere mantener la cola coherente cuando cambia una prioridad.</w:t>
+              <w:t>Favorece búsquedas y atención de la cabecera. Las extracciones arbitrarias siguen siendo lineales.</w:t>
             </w:r>
           </w:p>
         </w:tc>
@@ -2076,7 +1843,7 @@
         <w:pStyle w:val="DizeoCompacto"/>
       </w:pPr>
       <w:r>
-        <w:t>Notación: n = actividades; q = actividades pendientes en la cola; w = trabajadores; a = asignaciones; o = obras; u = usuarios. Espacio auxiliar significa memoria temporal adicional al almacenamiento de las colecciones.</w:t>
+        <w:t>Notación: n = actividades; q = pendientes en la cola; w = trabajadores; a = asignaciones; o = obras; u = usuarios. Espacio auxiliar es memoria temporal adicional a las colecciones.</w:t>
       </w:r>
     </w:p>
     <w:p>
@@ -2527,7 +2294,7 @@
                 <w:color w:val="000000"/>
                 <w:sz w:val="22"/>
               </w:rPr>
-              <w:t>O(1) con peek</w:t>
+              <w:t>O(1): peek</w:t>
             </w:r>
           </w:p>
         </w:tc>
@@ -2677,7 +2444,7 @@
                 <w:color w:val="000000"/>
                 <w:sz w:val="22"/>
               </w:rPr>
-              <w:t>O(log q) con poll</w:t>
+              <w:t>O(log q): poll</w:t>
             </w:r>
           </w:p>
         </w:tc>
@@ -2740,7 +2507,7 @@
                 <w:color w:val="000000"/>
                 <w:sz w:val="22"/>
               </w:rPr>
-              <w:t>Actualizar prioridad arbitraria</w:t>
+              <w:t>Retirar una pendiente distinta de la cabecera</w:t>
             </w:r>
           </w:p>
         </w:tc>
@@ -2827,7 +2594,7 @@
                 <w:color w:val="000000"/>
                 <w:sz w:val="22"/>
               </w:rPr>
-              <w:t>O(q): remove y offer</w:t>
+              <w:t>O(q): remove(objeto)</w:t>
             </w:r>
           </w:p>
         </w:tc>
@@ -2890,7 +2657,7 @@
                 <w:color w:val="000000"/>
                 <w:sz w:val="22"/>
               </w:rPr>
-              <w:t>Listar pendientes en orden</w:t>
+              <w:t>Actualizar una prioridad arbitraria</w:t>
             </w:r>
           </w:p>
         </w:tc>
@@ -2919,7 +2686,7 @@
                 <w:color w:val="000000"/>
                 <w:sz w:val="22"/>
               </w:rPr>
-              <w:t>O(q log q)</w:t>
+              <w:t>O(q)</w:t>
             </w:r>
           </w:p>
         </w:tc>
@@ -2948,7 +2715,7 @@
                 <w:color w:val="000000"/>
                 <w:sz w:val="22"/>
               </w:rPr>
-              <w:t>O(q)</w:t>
+              <w:t>O(1)</w:t>
             </w:r>
           </w:p>
         </w:tc>
@@ -2977,7 +2744,7 @@
                 <w:color w:val="000000"/>
                 <w:sz w:val="22"/>
               </w:rPr>
-              <w:t>O(q log q)</w:t>
+              <w:t>O(q): remove, cambio y offer</w:t>
             </w:r>
           </w:p>
         </w:tc>
@@ -3006,7 +2773,7 @@
                 <w:color w:val="000000"/>
                 <w:sz w:val="22"/>
               </w:rPr>
-              <w:t>O(q)</w:t>
+              <w:t>O(1)</w:t>
             </w:r>
           </w:p>
         </w:tc>
@@ -3040,6 +2807,156 @@
                 <w:color w:val="000000"/>
                 <w:sz w:val="22"/>
               </w:rPr>
+              <w:t>Listar pendientes o consultar alternativas en orden</w:t>
+            </w:r>
+          </w:p>
+        </w:tc>
+        <w:tc>
+          <w:tcPr>
+            <w:tcW w:type="dxa" w:w="1224"/>
+            <w:vAlign w:val="center"/>
+            <w:shd w:fill="FFFFFF"/>
+            <w:tcMar>
+              <w:top w:w="85" w:type="dxa"/>
+              <w:left w:w="85" w:type="dxa"/>
+              <w:bottom w:w="85" w:type="dxa"/>
+              <w:right w:w="85" w:type="dxa"/>
+            </w:tcMar>
+          </w:tcPr>
+          <w:p>
+            <w:pPr>
+              <w:pStyle w:val="DizeoCompacto"/>
+              <w:spacing w:after="60" w:before="40"/>
+              <w:jc w:val="left"/>
+            </w:pPr>
+            <w:r>
+              <w:rPr>
+                <w:rFonts w:ascii="Calibri" w:hAnsi="Calibri"/>
+                <w:b w:val="0"/>
+                <w:color w:val="000000"/>
+                <w:sz w:val="22"/>
+              </w:rPr>
+              <w:t>O(q log q)</w:t>
+            </w:r>
+          </w:p>
+        </w:tc>
+        <w:tc>
+          <w:tcPr>
+            <w:tcW w:type="dxa" w:w="1080"/>
+            <w:vAlign w:val="center"/>
+            <w:shd w:fill="FFFFFF"/>
+            <w:tcMar>
+              <w:top w:w="85" w:type="dxa"/>
+              <w:left w:w="85" w:type="dxa"/>
+              <w:bottom w:w="85" w:type="dxa"/>
+              <w:right w:w="85" w:type="dxa"/>
+            </w:tcMar>
+          </w:tcPr>
+          <w:p>
+            <w:pPr>
+              <w:pStyle w:val="DizeoCompacto"/>
+              <w:spacing w:after="60" w:before="40"/>
+              <w:jc w:val="left"/>
+            </w:pPr>
+            <w:r>
+              <w:rPr>
+                <w:rFonts w:ascii="Calibri" w:hAnsi="Calibri"/>
+                <w:b w:val="0"/>
+                <w:color w:val="000000"/>
+                <w:sz w:val="22"/>
+              </w:rPr>
+              <w:t>O(q)</w:t>
+            </w:r>
+          </w:p>
+        </w:tc>
+        <w:tc>
+          <w:tcPr>
+            <w:tcW w:type="dxa" w:w="2592"/>
+            <w:vAlign w:val="center"/>
+            <w:shd w:fill="FFFFFF"/>
+            <w:tcMar>
+              <w:top w:w="85" w:type="dxa"/>
+              <w:left w:w="85" w:type="dxa"/>
+              <w:bottom w:w="85" w:type="dxa"/>
+              <w:right w:w="85" w:type="dxa"/>
+            </w:tcMar>
+          </w:tcPr>
+          <w:p>
+            <w:pPr>
+              <w:pStyle w:val="DizeoCompacto"/>
+              <w:spacing w:after="60" w:before="40"/>
+              <w:jc w:val="left"/>
+            </w:pPr>
+            <w:r>
+              <w:rPr>
+                <w:rFonts w:ascii="Calibri" w:hAnsi="Calibri"/>
+                <w:b w:val="0"/>
+                <w:color w:val="000000"/>
+                <w:sz w:val="22"/>
+              </w:rPr>
+              <w:t>O(q log q)</w:t>
+            </w:r>
+          </w:p>
+        </w:tc>
+        <w:tc>
+          <w:tcPr>
+            <w:tcW w:type="dxa" w:w="1080"/>
+            <w:vAlign w:val="center"/>
+            <w:shd w:fill="FFFFFF"/>
+            <w:tcMar>
+              <w:top w:w="85" w:type="dxa"/>
+              <w:left w:w="85" w:type="dxa"/>
+              <w:bottom w:w="85" w:type="dxa"/>
+              <w:right w:w="85" w:type="dxa"/>
+            </w:tcMar>
+          </w:tcPr>
+          <w:p>
+            <w:pPr>
+              <w:pStyle w:val="DizeoCompacto"/>
+              <w:spacing w:after="60" w:before="40"/>
+              <w:jc w:val="left"/>
+            </w:pPr>
+            <w:r>
+              <w:rPr>
+                <w:rFonts w:ascii="Calibri" w:hAnsi="Calibri"/>
+                <w:b w:val="0"/>
+                <w:color w:val="000000"/>
+                <w:sz w:val="22"/>
+              </w:rPr>
+              <w:t>O(q)</w:t>
+            </w:r>
+          </w:p>
+        </w:tc>
+      </w:tr>
+      <w:tr>
+        <w:trPr>
+          <w:cantSplit/>
+        </w:trPr>
+        <w:tc>
+          <w:tcPr>
+            <w:tcW w:type="dxa" w:w="2232"/>
+            <w:vAlign w:val="center"/>
+            <w:shd w:fill="FFFFFF"/>
+            <w:tcMar>
+              <w:top w:w="85" w:type="dxa"/>
+              <w:left w:w="85" w:type="dxa"/>
+              <w:bottom w:w="85" w:type="dxa"/>
+              <w:right w:w="85" w:type="dxa"/>
+            </w:tcMar>
+          </w:tcPr>
+          <w:p>
+            <w:pPr>
+              <w:pStyle w:val="DizeoCompacto"/>
+              <w:spacing w:after="60" w:before="40"/>
+              <w:jc w:val="left"/>
+            </w:pPr>
+            <w:r>
+              <w:rPr>
+                <w:rFonts w:ascii="Calibri" w:hAnsi="Calibri"/>
+                <w:b w:val="0"/>
+                <w:color w:val="000000"/>
+                <w:sz w:val="22"/>
+              </w:rPr>
               <w:t>Comprobar cruces de un trabajador</w:t>
             </w:r>
           </w:p>
@@ -3167,7 +3084,7 @@
         <w:pStyle w:val="DizeoCompacto"/>
       </w:pPr>
       <w:r>
-        <w:t>El almacenamiento total en ambas alternativas es O(o + w + n + u + a). En B, la cola conserva q referencias adicionales y q ≤ n. Estas cotas describen el diseño; no son mediciones de una implementación.</w:t>
+        <w:t>El almacenamiento total de ambas propuestas es O(o + w + n + u + a). B agrega las referencias de la cola, con q ≤ n, y sus mapas. Las complejidades son análisis del diseño, no mediciones del programa.</w:t>
       </w:r>
     </w:p>
     <w:p>
@@ -3175,7 +3092,7 @@
         <w:pStyle w:val="DizeoCompacto"/>
       </w:pPr>
       <w:r>
-        <w:t>En A, la próxima actividad se obtiene recorriendo las pendientes y retirando la elegida. En B, PriorityQueue permite consultar la cabecera en O(1) y retirarla en O(log q). Sus iteradores no garantizan el orden de prioridad: para listar todo el orden se copia la cola y se extraen sus elementos. Si se cambia una prioridad, se retira el objeto antes de modificarlo y se vuelve a insertar; remove(objeto) es lineal (Oracle, s. f.-b).</w:t>
+        <w:t>Para obtener alternativas ordenadas se copia la colección sin modificar la original. En A se ordena la copia; en B se copia la cola y se extraen sus elementos. Recorrer el iterador de PriorityQueue no asegura orden. Consultar alternativas cuesta O(q log q) y O(q) de espacio en las dos propuestas; seleccionar otra actividad no conserva la mejora de poll(), porque su retiro usa remove(objeto), de costo O(q) (Oracle, s. f.-b).</w:t>
       </w:r>
     </w:p>
     <w:p>
@@ -3183,7 +3100,15 @@
         <w:pStyle w:val="DizeoCompacto"/>
       </w:pPr>
       <w:r>
-        <w:t>HashMap permite consultar por código con costo constante esperado bajo una dispersión adecuada de las claves (Oracle, s. f.-a). En ambas alternativas, los cruces se comprueban recorriendo las asignaciones activas. Para intervalos del mismo día [inicio, fin), existe cruce si inicio1 &lt; fin2 e inicio2 &lt; fin1.</w:t>
+        <w:t>Las cotas anteriores separan el orden de atención de la búsqueda de personal. Comprobar especialidad y disponibilidad de todos los trabajadores mediante recorridos tiene costo O(w(a + 1)) y espacio auxiliar O(1), sin contar la lista de candidatos devuelta. Si se revisan k actividades de la copia, con k ≤ q, el recorrido de validaciones agrega O(k w(a + 1)) al ordenamiento. HashMap tiene costo constante esperado de consulta bajo una dispersión adecuada de claves (Oracle, s. f.-a).</w:t>
+      </w:r>
+    </w:p>
+    <w:p>
+      <w:pPr>
+        <w:pStyle w:val="DizeoCompacto"/>
+      </w:pPr>
+      <w:r>
+        <w:t>Solo se comparan asignaciones activas del mismo trabajador y fecha. Los intervalos [inicio1, fin1) y [inicio2, fin2) se cruzan si inicio1 &lt; fin2 e inicio2 &lt; fin1. Terminar a la hora en que comienza otra actividad no produce cruce en este modelo.</w:t>
       </w:r>
     </w:p>
     <w:p>
@@ -3209,7 +3134,7 @@
         <w:pStyle w:val="DizeoCompacto"/>
       </w:pPr>
       <w:r>
-        <w:t>Se selecciona la alternativa B: HashMap para búsquedas por código, PriorityQueue para actividades pendientes y ArrayList para asignaciones. Esta combinación se ajusta a las consultas y a la priorización que requiere el proyecto.</w:t>
+        <w:t>Se selecciona la alternativa B: HashMap para búsquedas por código, PriorityQueue para pendientes y ArrayList para asignaciones. GestorPrioridades concentra las operaciones de la cola; el supervisor decide si consulta otras actividades cuando la primera no tiene personal disponible.</w:t>
       </w:r>
     </w:p>
     <w:tbl>
@@ -3353,7 +3278,7 @@
                 <w:color w:val="000000"/>
                 <w:sz w:val="22"/>
               </w:rPr>
-              <w:t>Permite identificar obras y trabajadores por código y consultar la actividad pendiente con mayor prioridad.</w:t>
+              <w:t>Consulta rápida por código y atención ordenada de pendientes; conserva la decisión del supervisor cuando hay restricciones.</w:t>
             </w:r>
           </w:p>
         </w:tc>
@@ -3387,7 +3312,7 @@
                 <w:color w:val="000000"/>
                 <w:sz w:val="22"/>
               </w:rPr>
-              <w:t>Tiempo de ejecución</w:t>
+              <w:t>Tiempo</w:t>
             </w:r>
           </w:p>
         </w:tc>
@@ -3416,7 +3341,7 @@
                 <w:color w:val="000000"/>
                 <w:sz w:val="22"/>
               </w:rPr>
-              <w:t>Buscar trabajador pasa de O(w) a O(1) esperado. Elegir y retirar la próxima pendiente pasa de O(q) a O(log q).</w:t>
+              <w:t>Búsqueda O(1) esperada, consulta de cabecera O(1) y extracción de cabecera O(log q). Retirar otra actividad sigue en O(q).</w:t>
             </w:r>
           </w:p>
         </w:tc>
@@ -3479,7 +3404,7 @@
                 <w:color w:val="000000"/>
                 <w:sz w:val="22"/>
               </w:rPr>
-              <w:t>Ambas alternativas mantienen un orden de memoria lineal. B agrega referencias en la cola y la estructura interna de los mapas.</w:t>
+              <w:t>Ambas opciones tienen memoria lineal. B agrega mapas y referencias; consultar alternativas añade O(q) temporal.</w:t>
             </w:r>
           </w:p>
         </w:tc>
@@ -3542,7 +3467,7 @@
                 <w:color w:val="000000"/>
                 <w:sz w:val="22"/>
               </w:rPr>
-              <w:t>Las extracciones repetidas crecen logarítmicamente en la cola. La comprobación de cruces conserva O(a) en ambas alternativas.</w:t>
+              <w:t>La mejora favorece la cabecera y las consultas por código. Buscar personal y consultar todas las alternativas conservan sus costos de recorrido.</w:t>
             </w:r>
           </w:p>
         </w:tc>
@@ -3605,7 +3530,7 @@
                 <w:color w:val="000000"/>
                 <w:sz w:val="22"/>
               </w:rPr>
-              <w:t>Las reglas del comparador y las operaciones de la cola se concentran en un componente de prioridades.</w:t>
+              <w:t>GestorPrioridades centraliza comparador, actualización de claves y retiro de pendientes.</w:t>
             </w:r>
           </w:p>
         </w:tc>
@@ -3639,7 +3564,7 @@
                 <w:color w:val="000000"/>
                 <w:sz w:val="22"/>
               </w:rPr>
-              <w:t>Dificultad de implementación</w:t>
+              <w:t>Dificultad</w:t>
             </w:r>
           </w:p>
         </w:tc>
@@ -3668,7 +3593,7 @@
                 <w:color w:val="000000"/>
                 <w:sz w:val="22"/>
               </w:rPr>
-              <w:t>Usa colecciones estándar de Java. Requiere validar los datos y mantener la cola actualizada, sin implementar un heap desde cero.</w:t>
+              <w:t>Se utilizan colecciones estándar de Java y validaciones del dominio, sin desarrollar un heap desde cero.</w:t>
             </w:r>
           </w:p>
         </w:tc>
@@ -3679,7 +3604,16 @@
         <w:pStyle w:val="DizeoCompacto"/>
       </w:pPr>
       <w:r>
-        <w:t>Con 100 actividades, ambas opciones son viables. La selección se fundamenta en la correspondencia entre las operaciones y las estructuras, así como en el aprendizaje de colas de prioridad; no exige aumentar el volumen del proyecto. PriorityQueue y HashMap documentan los comportamientos utilizados en la comparación (Oracle, s. f.-a, s. f.-b).</w:t>
+        <w:t>Con 100 actividades, ambas propuestas son viables. B se elige por su correspondencia con búsquedas repetidas y la atención normal de la cabecera, no porque todas las operaciones sean más rápidas. Oracle documenta estos costos de HashMap y PriorityQueue (s. f.-a, s. f.-b).</w:t>
+      </w:r>
+    </w:p>
+    <w:p>
+      <w:pPr>
+        <w:pStyle w:val="DizeoSubtitulo"/>
+        <w:spacing w:before="200" w:after="160"/>
+      </w:pPr>
+      <w:r>
+        <w:t>Caso de uso cuando la primera actividad no tiene personal</w:t>
       </w:r>
     </w:p>
     <w:p>
@@ -3687,7 +3621,351 @@
         <w:pStyle w:val="DizeoCompacto"/>
       </w:pPr>
       <w:r>
-        <w:t>La cola contiene actividades pendientes y sin asignación activa. Una actividad se retira del orden de atención después de confirmar una asignación válida. La prioridad nunca sustituye la comprobación de especialidad, jornada y ausencia de cruces.</w:t>
+        <w:t>Ejemplo ilustrativo del comportamiento propuesto: A01 tiene prioridad alta y requiere gypsum; A02 tiene prioridad media y requiere pintura. Para la fecha y el intervalo consultados, los especialistas en gypsum están ocupados y existe un pintor libre. El ejemplo explica la regla; no se presenta como incidente confirmado de Dizeo.</w:t>
+      </w:r>
+    </w:p>
+    <w:tbl>
+      <w:tblPr>
+        <w:tblW w:type="auto" w:w="0"/>
+        <w:jc w:val="center"/>
+        <w:tblLayout w:type="fixed"/>
+        <w:tblLook w:firstColumn="1" w:firstRow="1" w:lastColumn="0" w:lastRow="0" w:noHBand="0" w:noVBand="1" w:val="04A0"/>
+        <w:tblBorders>
+          <w:top w:val="single" w:sz="4" w:color="000000"/>
+          <w:left w:val="single" w:sz="4" w:color="000000"/>
+          <w:bottom w:val="single" w:sz="4" w:color="000000"/>
+          <w:right w:val="single" w:sz="4" w:color="000000"/>
+          <w:insideH w:val="single" w:sz="4" w:color="000000"/>
+          <w:insideV w:val="single" w:sz="4" w:color="000000"/>
+        </w:tblBorders>
+      </w:tblPr>
+      <w:tblGrid>
+        <w:gridCol w:w="1800"/>
+        <w:gridCol w:w="6408"/>
+      </w:tblGrid>
+      <w:tr>
+        <w:trPr>
+          <w:cantSplit/>
+          <w:tblHeader/>
+        </w:trPr>
+        <w:tc>
+          <w:tcPr>
+            <w:tcW w:type="dxa" w:w="1800"/>
+            <w:vAlign w:val="center"/>
+            <w:shd w:fill="747474"/>
+            <w:tcMar>
+              <w:top w:w="85" w:type="dxa"/>
+              <w:left w:w="85" w:type="dxa"/>
+              <w:bottom w:w="85" w:type="dxa"/>
+              <w:right w:w="85" w:type="dxa"/>
+            </w:tcMar>
+          </w:tcPr>
+          <w:p>
+            <w:pPr>
+              <w:pStyle w:val="DizeoCompacto"/>
+              <w:spacing w:after="60" w:before="40"/>
+              <w:jc w:val="center"/>
+            </w:pPr>
+            <w:r>
+              <w:rPr>
+                <w:rFonts w:ascii="Calibri" w:hAnsi="Calibri"/>
+                <w:b/>
+                <w:color w:val="FFFFFF"/>
+                <w:sz w:val="22"/>
+              </w:rPr>
+              <w:t>Paso</w:t>
+            </w:r>
+          </w:p>
+        </w:tc>
+        <w:tc>
+          <w:tcPr>
+            <w:tcW w:type="dxa" w:w="6408"/>
+            <w:vAlign w:val="center"/>
+            <w:shd w:fill="747474"/>
+            <w:tcMar>
+              <w:top w:w="85" w:type="dxa"/>
+              <w:left w:w="85" w:type="dxa"/>
+              <w:bottom w:w="85" w:type="dxa"/>
+              <w:right w:w="85" w:type="dxa"/>
+            </w:tcMar>
+          </w:tcPr>
+          <w:p>
+            <w:pPr>
+              <w:pStyle w:val="DizeoCompacto"/>
+              <w:spacing w:after="60" w:before="40"/>
+              <w:jc w:val="center"/>
+            </w:pPr>
+            <w:r>
+              <w:rPr>
+                <w:rFonts w:ascii="Calibri" w:hAnsi="Calibri"/>
+                <w:b/>
+                <w:color w:val="FFFFFF"/>
+                <w:sz w:val="22"/>
+              </w:rPr>
+              <w:t>Decisión y estado de las pendientes</w:t>
+            </w:r>
+          </w:p>
+        </w:tc>
+      </w:tr>
+      <w:tr>
+        <w:trPr>
+          <w:cantSplit/>
+        </w:trPr>
+        <w:tc>
+          <w:tcPr>
+            <w:tcW w:type="dxa" w:w="1800"/>
+            <w:vAlign w:val="center"/>
+            <w:shd w:fill="FFFFFF"/>
+            <w:tcMar>
+              <w:top w:w="85" w:type="dxa"/>
+              <w:left w:w="85" w:type="dxa"/>
+              <w:bottom w:w="85" w:type="dxa"/>
+              <w:right w:w="85" w:type="dxa"/>
+            </w:tcMar>
+          </w:tcPr>
+          <w:p>
+            <w:pPr>
+              <w:pStyle w:val="DizeoCompacto"/>
+              <w:spacing w:after="60" w:before="40"/>
+              <w:jc w:val="left"/>
+            </w:pPr>
+            <w:r>
+              <w:rPr>
+                <w:rFonts w:ascii="Calibri" w:hAnsi="Calibri"/>
+                <w:b w:val="0"/>
+                <w:color w:val="000000"/>
+                <w:sz w:val="22"/>
+              </w:rPr>
+              <w:t>1 Consultar A01</w:t>
+            </w:r>
+          </w:p>
+        </w:tc>
+        <w:tc>
+          <w:tcPr>
+            <w:tcW w:type="dxa" w:w="6408"/>
+            <w:vAlign w:val="center"/>
+            <w:shd w:fill="FFFFFF"/>
+            <w:tcMar>
+              <w:top w:w="85" w:type="dxa"/>
+              <w:left w:w="85" w:type="dxa"/>
+              <w:bottom w:w="85" w:type="dxa"/>
+              <w:right w:w="85" w:type="dxa"/>
+            </w:tcMar>
+          </w:tcPr>
+          <w:p>
+            <w:pPr>
+              <w:pStyle w:val="DizeoCompacto"/>
+              <w:spacing w:after="60" w:before="40"/>
+              <w:jc w:val="left"/>
+            </w:pPr>
+            <w:r>
+              <w:rPr>
+                <w:rFonts w:ascii="Calibri" w:hAnsi="Calibri"/>
+                <w:b w:val="0"/>
+                <w:color w:val="000000"/>
+                <w:sz w:val="22"/>
+              </w:rPr>
+              <w:t>peek() muestra A01. Al no existir personal compatible y libre, se informa la causa. A01 permanece en la cola con prioridad alta.</w:t>
+            </w:r>
+          </w:p>
+        </w:tc>
+      </w:tr>
+      <w:tr>
+        <w:trPr>
+          <w:cantSplit/>
+        </w:trPr>
+        <w:tc>
+          <w:tcPr>
+            <w:tcW w:type="dxa" w:w="1800"/>
+            <w:vAlign w:val="center"/>
+            <w:shd w:fill="FFFFFF"/>
+            <w:tcMar>
+              <w:top w:w="85" w:type="dxa"/>
+              <w:left w:w="85" w:type="dxa"/>
+              <w:bottom w:w="85" w:type="dxa"/>
+              <w:right w:w="85" w:type="dxa"/>
+            </w:tcMar>
+          </w:tcPr>
+          <w:p>
+            <w:pPr>
+              <w:pStyle w:val="DizeoCompacto"/>
+              <w:spacing w:after="60" w:before="40"/>
+              <w:jc w:val="left"/>
+            </w:pPr>
+            <w:r>
+              <w:rPr>
+                <w:rFonts w:ascii="Calibri" w:hAnsi="Calibri"/>
+                <w:b w:val="0"/>
+                <w:color w:val="000000"/>
+                <w:sz w:val="22"/>
+              </w:rPr>
+              <w:t>2 Consultar alternativas</w:t>
+            </w:r>
+          </w:p>
+        </w:tc>
+        <w:tc>
+          <w:tcPr>
+            <w:tcW w:type="dxa" w:w="6408"/>
+            <w:vAlign w:val="center"/>
+            <w:shd w:fill="FFFFFF"/>
+            <w:tcMar>
+              <w:top w:w="85" w:type="dxa"/>
+              <w:left w:w="85" w:type="dxa"/>
+              <w:bottom w:w="85" w:type="dxa"/>
+              <w:right w:w="85" w:type="dxa"/>
+            </w:tcMar>
+          </w:tcPr>
+          <w:p>
+            <w:pPr>
+              <w:pStyle w:val="DizeoCompacto"/>
+              <w:spacing w:after="60" w:before="40"/>
+              <w:jc w:val="left"/>
+            </w:pPr>
+            <w:r>
+              <w:rPr>
+                <w:rFonts w:ascii="Calibri" w:hAnsi="Calibri"/>
+                <w:b w:val="0"/>
+                <w:color w:val="000000"/>
+                <w:sz w:val="22"/>
+              </w:rPr>
+              <w:t>El supervisor puede esperar o pedir la lista ordenada. La consulta trabaja con una copia: A01 y A02 siguen en la cola original.</w:t>
+            </w:r>
+          </w:p>
+        </w:tc>
+      </w:tr>
+      <w:tr>
+        <w:trPr>
+          <w:cantSplit/>
+        </w:trPr>
+        <w:tc>
+          <w:tcPr>
+            <w:tcW w:type="dxa" w:w="1800"/>
+            <w:vAlign w:val="center"/>
+            <w:shd w:fill="FFFFFF"/>
+            <w:tcMar>
+              <w:top w:w="85" w:type="dxa"/>
+              <w:left w:w="85" w:type="dxa"/>
+              <w:bottom w:w="85" w:type="dxa"/>
+              <w:right w:w="85" w:type="dxa"/>
+            </w:tcMar>
+          </w:tcPr>
+          <w:p>
+            <w:pPr>
+              <w:pStyle w:val="DizeoCompacto"/>
+              <w:spacing w:after="60" w:before="40"/>
+              <w:jc w:val="left"/>
+            </w:pPr>
+            <w:r>
+              <w:rPr>
+                <w:rFonts w:ascii="Calibri" w:hAnsi="Calibri"/>
+                <w:b w:val="0"/>
+                <w:color w:val="000000"/>
+                <w:sz w:val="22"/>
+              </w:rPr>
+              <w:t>3 Elegir A02</w:t>
+            </w:r>
+          </w:p>
+        </w:tc>
+        <w:tc>
+          <w:tcPr>
+            <w:tcW w:type="dxa" w:w="6408"/>
+            <w:vAlign w:val="center"/>
+            <w:shd w:fill="FFFFFF"/>
+            <w:tcMar>
+              <w:top w:w="85" w:type="dxa"/>
+              <w:left w:w="85" w:type="dxa"/>
+              <w:bottom w:w="85" w:type="dxa"/>
+              <w:right w:w="85" w:type="dxa"/>
+            </w:tcMar>
+          </w:tcPr>
+          <w:p>
+            <w:pPr>
+              <w:pStyle w:val="DizeoCompacto"/>
+              <w:spacing w:after="60" w:before="40"/>
+              <w:jc w:val="left"/>
+            </w:pPr>
+            <w:r>
+              <w:rPr>
+                <w:rFonts w:ascii="Calibri" w:hAnsi="Calibri"/>
+                <w:b w:val="0"/>
+                <w:color w:val="000000"/>
+                <w:sz w:val="22"/>
+              </w:rPr>
+              <w:t>El supervisor selecciona A02. Se vuelven a validar especialidad, jornada y cruces antes de confirmar la asignación.</w:t>
+            </w:r>
+          </w:p>
+        </w:tc>
+      </w:tr>
+      <w:tr>
+        <w:trPr>
+          <w:cantSplit/>
+        </w:trPr>
+        <w:tc>
+          <w:tcPr>
+            <w:tcW w:type="dxa" w:w="1800"/>
+            <w:vAlign w:val="center"/>
+            <w:shd w:fill="FFFFFF"/>
+            <w:tcMar>
+              <w:top w:w="85" w:type="dxa"/>
+              <w:left w:w="85" w:type="dxa"/>
+              <w:bottom w:w="85" w:type="dxa"/>
+              <w:right w:w="85" w:type="dxa"/>
+            </w:tcMar>
+          </w:tcPr>
+          <w:p>
+            <w:pPr>
+              <w:pStyle w:val="DizeoCompacto"/>
+              <w:spacing w:after="60" w:before="40"/>
+              <w:jc w:val="left"/>
+            </w:pPr>
+            <w:r>
+              <w:rPr>
+                <w:rFonts w:ascii="Calibri" w:hAnsi="Calibri"/>
+                <w:b w:val="0"/>
+                <w:color w:val="000000"/>
+                <w:sz w:val="22"/>
+              </w:rPr>
+              <w:t>4 Confirmar o rechazar</w:t>
+            </w:r>
+          </w:p>
+        </w:tc>
+        <w:tc>
+          <w:tcPr>
+            <w:tcW w:type="dxa" w:w="6408"/>
+            <w:vAlign w:val="center"/>
+            <w:shd w:fill="FFFFFF"/>
+            <w:tcMar>
+              <w:top w:w="85" w:type="dxa"/>
+              <w:left w:w="85" w:type="dxa"/>
+              <w:bottom w:w="85" w:type="dxa"/>
+              <w:right w:w="85" w:type="dxa"/>
+            </w:tcMar>
+          </w:tcPr>
+          <w:p>
+            <w:pPr>
+              <w:pStyle w:val="DizeoCompacto"/>
+              <w:spacing w:after="60" w:before="40"/>
+              <w:jc w:val="left"/>
+            </w:pPr>
+            <w:r>
+              <w:rPr>
+                <w:rFonts w:ascii="Calibri" w:hAnsi="Calibri"/>
+                <w:b w:val="0"/>
+                <w:color w:val="000000"/>
+                <w:sz w:val="22"/>
+              </w:rPr>
+              <w:t>Si la validación es correcta, se registra la asignación y se retira únicamente A02 mediante remove(objeto), O(q). Si falla, no se confirma ni se retira ninguna pendiente.</w:t>
+            </w:r>
+          </w:p>
+        </w:tc>
+      </w:tr>
+    </w:tbl>
+    <w:p>
+      <w:pPr>
+        <w:pStyle w:val="DizeoCompacto"/>
+      </w:pPr>
+      <w:r>
+        <w:t>Después de confirmar A02, A01 sigue siendo la cabecera y podrá atenderse cuando exista personal. Su prioridad no se rebaja automáticamente. Si ninguna actividad es viable o el supervisor decide esperar, la cola se conserva. La confirmación debe mantener juntos el registro de la asignación y el retiro de la cola; si una actualización falla, se restaura el estado previo.</w:t>
       </w:r>
     </w:p>
     <w:p>
@@ -3921,7 +4199,7 @@
                 <w:color w:val="000000"/>
                 <w:sz w:val="22"/>
               </w:rPr>
-              <w:t>M2 Trabajadores y M4 Asignación. Disponibilidad y validación de horarios.</w:t>
+              <w:t>M2 Trabajadores y M4 Asignación. Disponibilidad, horarios y confirmación consistente.</w:t>
             </w:r>
           </w:p>
         </w:tc>
@@ -3984,7 +4262,7 @@
                 <w:color w:val="000000"/>
                 <w:sz w:val="22"/>
               </w:rPr>
-              <w:t>M3 Actividades y prioridades. Comparador, cola de prioridad, UML y comparación técnica.</w:t>
+              <w:t>M3 Actividades y GestorPrioridades. Comparador, cola, UML y comparación técnica.</w:t>
             </w:r>
           </w:p>
         </w:tc>
@@ -3995,7 +4273,7 @@
         <w:pStyle w:val="DizeoCompacto"/>
       </w:pPr>
       <w:r>
-        <w:t>La integración y la revisión del informe, el UML y la presentación se realizarán entre los tres integrantes.</w:t>
+        <w:t>La integración es compartida. El equipo de tres integrantes cuenta con autorización docente, según la confirmación de Julián Jiménez. El repositorio conserva el informe, la presentación y el UML editable para verificar la correspondencia entre los entregables.</w:t>
       </w:r>
     </w:p>
     <w:p>
@@ -4012,7 +4290,7 @@
         <w:pStyle w:val="DizeoCompacto"/>
       </w:pPr>
       <w:r>
-        <w:t>README.md describe el proyecto, el alcance, los integrantes, los módulos y la alternativa seleccionada. La carpeta docs contiene informe/ para el Word y el PDF; presentacion/ para las diapositivas; uml/ para el diagrama editable y su revisión; y plan/ para conservar las observaciones docentes de Progreso 2.</w:t>
+        <w:t>README.md presenta el alcance y la alternativa seleccionada. docs/informe contiene el Word y el PDF; docs/presentacion, las diapositivas; docs/uml, las dos vistas de dizeo.drawio y REVISION.md; docs/plan, las observaciones docentes para Progreso 2.</w:t>
       </w:r>
     </w:p>
     <w:p>
@@ -4165,7 +4443,7 @@
                 <w:color w:val="000000"/>
                 <w:sz w:val="22"/>
               </w:rPr>
-              <w:t>Validar fecha, jornada e intervalos antes de asignar o reprogramar.</w:t>
+              <w:t>Revalidar especialidad, jornada e intervalos al confirmar o reprogramar.</w:t>
             </w:r>
           </w:p>
         </w:tc>
@@ -4199,7 +4477,7 @@
                 <w:color w:val="000000"/>
                 <w:sz w:val="22"/>
               </w:rPr>
-              <w:t>Orden incorrecto de prioridades</w:t>
+              <w:t>Clave modificada dentro del heap</w:t>
             </w:r>
           </w:p>
         </w:tc>
@@ -4228,7 +4506,7 @@
                 <w:color w:val="000000"/>
                 <w:sz w:val="22"/>
               </w:rPr>
-              <w:t>Usar un único comparador y comprobar los empates por fecha y código.</w:t>
+              <w:t>Canalizar los cambios por GestorPrioridades: retirar, modificar y reinsertar.</w:t>
             </w:r>
           </w:p>
         </w:tc>
@@ -4262,7 +4540,7 @@
                 <w:color w:val="000000"/>
                 <w:sz w:val="22"/>
               </w:rPr>
-              <w:t>Cola desactualizada</w:t>
+              <w:t>Pérdida de una tarea sin personal</w:t>
             </w:r>
           </w:p>
         </w:tc>
@@ -4291,7 +4569,7 @@
                 <w:color w:val="000000"/>
                 <w:sz w:val="22"/>
               </w:rPr>
-              <w:t>Retirar y reinsertar al cambiar prioridad; sincronizar el estado de la actividad con su asignación.</w:t>
+              <w:t>Consultar alternativas sobre una copia y retirar solo la actividad cuya asignación se confirma.</w:t>
             </w:r>
           </w:p>
         </w:tc>
@@ -4325,7 +4603,7 @@
                 <w:color w:val="000000"/>
                 <w:sz w:val="22"/>
               </w:rPr>
-              <w:t>Datos duplicados o incompletos</w:t>
+              <w:t>Asignación y cola inconsistentes</w:t>
             </w:r>
           </w:p>
         </w:tc>
@@ -4354,7 +4632,70 @@
                 <w:color w:val="000000"/>
                 <w:sz w:val="22"/>
               </w:rPr>
-              <w:t>Validar códigos únicos, campos obligatorios y porcentajes entre 0 y 100.</w:t>
+              <w:t>Si no concluyen ambas actualizaciones, restaurar el estado anterior; verificar que no haya duplicados.</w:t>
+            </w:r>
+          </w:p>
+        </w:tc>
+      </w:tr>
+      <w:tr>
+        <w:trPr>
+          <w:cantSplit/>
+        </w:trPr>
+        <w:tc>
+          <w:tcPr>
+            <w:tcW w:type="dxa" w:w="2160"/>
+            <w:vAlign w:val="center"/>
+            <w:shd w:fill="FFFFFF"/>
+            <w:tcMar>
+              <w:top w:w="85" w:type="dxa"/>
+              <w:left w:w="85" w:type="dxa"/>
+              <w:bottom w:w="85" w:type="dxa"/>
+              <w:right w:w="85" w:type="dxa"/>
+            </w:tcMar>
+          </w:tcPr>
+          <w:p>
+            <w:pPr>
+              <w:pStyle w:val="DizeoCompacto"/>
+              <w:spacing w:after="60" w:before="40"/>
+              <w:jc w:val="left"/>
+            </w:pPr>
+            <w:r>
+              <w:rPr>
+                <w:rFonts w:ascii="Calibri" w:hAnsi="Calibri"/>
+                <w:b w:val="0"/>
+                <w:color w:val="000000"/>
+                <w:sz w:val="22"/>
+              </w:rPr>
+              <w:t>Datos inválidos</w:t>
+            </w:r>
+          </w:p>
+        </w:tc>
+        <w:tc>
+          <w:tcPr>
+            <w:tcW w:type="dxa" w:w="6048"/>
+            <w:vAlign w:val="center"/>
+            <w:shd w:fill="FFFFFF"/>
+            <w:tcMar>
+              <w:top w:w="85" w:type="dxa"/>
+              <w:left w:w="85" w:type="dxa"/>
+              <w:bottom w:w="85" w:type="dxa"/>
+              <w:right w:w="85" w:type="dxa"/>
+            </w:tcMar>
+          </w:tcPr>
+          <w:p>
+            <w:pPr>
+              <w:pStyle w:val="DizeoCompacto"/>
+              <w:spacing w:after="60" w:before="40"/>
+              <w:jc w:val="left"/>
+            </w:pPr>
+            <w:r>
+              <w:rPr>
+                <w:rFonts w:ascii="Calibri" w:hAnsi="Calibri"/>
+                <w:b w:val="0"/>
+                <w:color w:val="000000"/>
+                <w:sz w:val="22"/>
+              </w:rPr>
+              <w:t>Validar códigos únicos, prioridad 1–3 y avance entre 0 y 100 %.</w:t>
             </w:r>
           </w:p>
         </w:tc>
@@ -4608,7 +4949,7 @@
                 <w:color w:val="000000"/>
                 <w:sz w:val="22"/>
               </w:rPr>
-              <w:t>Borradores del informe, UML y presentación.</w:t>
+              <w:t>Informe, UML y presentación.</w:t>
             </w:r>
           </w:p>
         </w:tc>
@@ -4637,7 +4978,7 @@
                 <w:color w:val="000000"/>
                 <w:sz w:val="22"/>
               </w:rPr>
-              <w:t>Contraste con fuentes y revisión grupal pendiente.</w:t>
+              <w:t>Contraste con fuentes y revisión grupal confirmada por el equipo.</w:t>
             </w:r>
           </w:p>
         </w:tc>
@@ -4648,7 +4989,7 @@
         <w:pStyle w:val="DizeoCompacto"/>
       </w:pPr>
       <w:r>
-        <w:t>El equipo revisará, adaptará y comprenderá el contenido incorporado y asumirá la responsabilidad académica y técnica de la entrega.</w:t>
+        <w:t>Julián Jiménez confirmó que Daniel Valarezo, Esteban Figueroa y él realizaron la revisión del informe y del UML. El equipo asume la responsabilidad de adaptar y comprender el contenido, las referencias y las decisiones de diseño incorporadas.</w:t>
       </w:r>
     </w:p>
     <w:p>
@@ -4674,7 +5015,7 @@
         <w:pStyle w:val="DizeoCompacto"/>
       </w:pPr>
       <w:r>
-        <w:t>Duración prevista: 9 minutos, más preguntas breves. Se presentarán el problema, los actores, las variables y restricciones; los cinco módulos; el UML; las dos alternativas; la comparación y selección; y el plan de implementación para Progreso 2.</w:t>
+        <w:t>Duración prevista: 9 minutos y 30 segundos, más preguntas breves. La presentación aborda el problema y sus variables, los módulos, el UML, las dos alternativas, la comparación, el caso de asignación y el plan de Progreso 2.</w:t>
       </w:r>
     </w:p>
     <w:tbl>
@@ -4694,8 +5035,8 @@
       </w:tblPr>
       <w:tblGrid>
         <w:gridCol w:w="1944"/>
-        <w:gridCol w:w="5184"/>
-        <w:gridCol w:w="1080"/>
+        <w:gridCol w:w="4824"/>
+        <w:gridCol w:w="1440"/>
       </w:tblGrid>
       <w:tr>
         <w:trPr>
@@ -4733,7 +5074,7 @@
         </w:tc>
         <w:tc>
           <w:tcPr>
-            <w:tcW w:type="dxa" w:w="5184"/>
+            <w:tcW w:type="dxa" w:w="4824"/>
             <w:vAlign w:val="center"/>
             <w:shd w:fill="747474"/>
             <w:tcMar>
@@ -4762,7 +5103,7 @@
         </w:tc>
         <w:tc>
           <w:tcPr>
-            <w:tcW w:type="dxa" w:w="1080"/>
+            <w:tcW w:type="dxa" w:w="1440"/>
             <w:vAlign w:val="center"/>
             <w:shd w:fill="747474"/>
             <w:tcMar>
@@ -4825,59 +5166,59 @@
         </w:tc>
         <w:tc>
           <w:tcPr>
-            <w:tcW w:type="dxa" w:w="5184"/>
-            <w:vAlign w:val="center"/>
-            <w:shd w:fill="FFFFFF"/>
-            <w:tcMar>
-              <w:top w:w="85" w:type="dxa"/>
-              <w:left w:w="85" w:type="dxa"/>
-              <w:bottom w:w="85" w:type="dxa"/>
-              <w:right w:w="85" w:type="dxa"/>
-            </w:tcMar>
-          </w:tcPr>
-          <w:p>
-            <w:pPr>
-              <w:pStyle w:val="DizeoCompacto"/>
-              <w:spacing w:after="60" w:before="40"/>
-              <w:jc w:val="left"/>
-            </w:pPr>
-            <w:r>
-              <w:rPr>
-                <w:rFonts w:ascii="Calibri" w:hAnsi="Calibri"/>
-                <w:b w:val="0"/>
-                <w:color w:val="000000"/>
-                <w:sz w:val="22"/>
-              </w:rPr>
-              <w:t>Introducción y problema; selección y fundamento.</w:t>
-            </w:r>
-          </w:p>
-        </w:tc>
-        <w:tc>
-          <w:tcPr>
-            <w:tcW w:type="dxa" w:w="1080"/>
-            <w:vAlign w:val="center"/>
-            <w:shd w:fill="FFFFFF"/>
-            <w:tcMar>
-              <w:top w:w="85" w:type="dxa"/>
-              <w:left w:w="85" w:type="dxa"/>
-              <w:bottom w:w="85" w:type="dxa"/>
-              <w:right w:w="85" w:type="dxa"/>
-            </w:tcMar>
-          </w:tcPr>
-          <w:p>
-            <w:pPr>
-              <w:pStyle w:val="DizeoCompacto"/>
-              <w:spacing w:after="60" w:before="40"/>
-              <w:jc w:val="left"/>
-            </w:pPr>
-            <w:r>
-              <w:rPr>
-                <w:rFonts w:ascii="Calibri" w:hAnsi="Calibri"/>
-                <w:b w:val="0"/>
-                <w:color w:val="000000"/>
-                <w:sz w:val="22"/>
-              </w:rPr>
-              <w:t>3 min</w:t>
+            <w:tcW w:type="dxa" w:w="4824"/>
+            <w:vAlign w:val="center"/>
+            <w:shd w:fill="FFFFFF"/>
+            <w:tcMar>
+              <w:top w:w="85" w:type="dxa"/>
+              <w:left w:w="85" w:type="dxa"/>
+              <w:bottom w:w="85" w:type="dxa"/>
+              <w:right w:w="85" w:type="dxa"/>
+            </w:tcMar>
+          </w:tcPr>
+          <w:p>
+            <w:pPr>
+              <w:pStyle w:val="DizeoCompacto"/>
+              <w:spacing w:after="60" w:before="40"/>
+              <w:jc w:val="left"/>
+            </w:pPr>
+            <w:r>
+              <w:rPr>
+                <w:rFonts w:ascii="Calibri" w:hAnsi="Calibri"/>
+                <w:b w:val="0"/>
+                <w:color w:val="000000"/>
+                <w:sz w:val="22"/>
+              </w:rPr>
+              <w:t>Introducción y problema; selección y caso de uso.</w:t>
+            </w:r>
+          </w:p>
+        </w:tc>
+        <w:tc>
+          <w:tcPr>
+            <w:tcW w:type="dxa" w:w="1440"/>
+            <w:vAlign w:val="center"/>
+            <w:shd w:fill="FFFFFF"/>
+            <w:tcMar>
+              <w:top w:w="85" w:type="dxa"/>
+              <w:left w:w="85" w:type="dxa"/>
+              <w:bottom w:w="85" w:type="dxa"/>
+              <w:right w:w="85" w:type="dxa"/>
+            </w:tcMar>
+          </w:tcPr>
+          <w:p>
+            <w:pPr>
+              <w:pStyle w:val="DizeoCompacto"/>
+              <w:spacing w:after="60" w:before="40"/>
+              <w:jc w:val="left"/>
+            </w:pPr>
+            <w:r>
+              <w:rPr>
+                <w:rFonts w:ascii="Calibri" w:hAnsi="Calibri"/>
+                <w:b w:val="0"/>
+                <w:color w:val="000000"/>
+                <w:sz w:val="22"/>
+              </w:rPr>
+              <w:t>3 min 10 s</w:t>
             </w:r>
           </w:p>
         </w:tc>
@@ -4917,59 +5258,59 @@
         </w:tc>
         <w:tc>
           <w:tcPr>
-            <w:tcW w:type="dxa" w:w="5184"/>
-            <w:vAlign w:val="center"/>
-            <w:shd w:fill="FFFFFF"/>
-            <w:tcMar>
-              <w:top w:w="85" w:type="dxa"/>
-              <w:left w:w="85" w:type="dxa"/>
-              <w:bottom w:w="85" w:type="dxa"/>
-              <w:right w:w="85" w:type="dxa"/>
-            </w:tcMar>
-          </w:tcPr>
-          <w:p>
-            <w:pPr>
-              <w:pStyle w:val="DizeoCompacto"/>
-              <w:spacing w:after="60" w:before="40"/>
-              <w:jc w:val="left"/>
-            </w:pPr>
-            <w:r>
-              <w:rPr>
-                <w:rFonts w:ascii="Calibri" w:hAnsi="Calibri"/>
-                <w:b w:val="0"/>
-                <w:color w:val="000000"/>
-                <w:sz w:val="22"/>
-              </w:rPr>
-              <w:t>Variables y restricciones; módulos; plan de implementación.</w:t>
-            </w:r>
-          </w:p>
-        </w:tc>
-        <w:tc>
-          <w:tcPr>
-            <w:tcW w:type="dxa" w:w="1080"/>
-            <w:vAlign w:val="center"/>
-            <w:shd w:fill="FFFFFF"/>
-            <w:tcMar>
-              <w:top w:w="85" w:type="dxa"/>
-              <w:left w:w="85" w:type="dxa"/>
-              <w:bottom w:w="85" w:type="dxa"/>
-              <w:right w:w="85" w:type="dxa"/>
-            </w:tcMar>
-          </w:tcPr>
-          <w:p>
-            <w:pPr>
-              <w:pStyle w:val="DizeoCompacto"/>
-              <w:spacing w:after="60" w:before="40"/>
-              <w:jc w:val="left"/>
-            </w:pPr>
-            <w:r>
-              <w:rPr>
-                <w:rFonts w:ascii="Calibri" w:hAnsi="Calibri"/>
-                <w:b w:val="0"/>
-                <w:color w:val="000000"/>
-                <w:sz w:val="22"/>
-              </w:rPr>
-              <w:t>3 min</w:t>
+            <w:tcW w:type="dxa" w:w="4824"/>
+            <w:vAlign w:val="center"/>
+            <w:shd w:fill="FFFFFF"/>
+            <w:tcMar>
+              <w:top w:w="85" w:type="dxa"/>
+              <w:left w:w="85" w:type="dxa"/>
+              <w:bottom w:w="85" w:type="dxa"/>
+              <w:right w:w="85" w:type="dxa"/>
+            </w:tcMar>
+          </w:tcPr>
+          <w:p>
+            <w:pPr>
+              <w:pStyle w:val="DizeoCompacto"/>
+              <w:spacing w:after="60" w:before="40"/>
+              <w:jc w:val="left"/>
+            </w:pPr>
+            <w:r>
+              <w:rPr>
+                <w:rFonts w:ascii="Calibri" w:hAnsi="Calibri"/>
+                <w:b w:val="0"/>
+                <w:color w:val="000000"/>
+                <w:sz w:val="22"/>
+              </w:rPr>
+              <w:t>Variables y módulos; plan de implementación.</w:t>
+            </w:r>
+          </w:p>
+        </w:tc>
+        <w:tc>
+          <w:tcPr>
+            <w:tcW w:type="dxa" w:w="1440"/>
+            <w:vAlign w:val="center"/>
+            <w:shd w:fill="FFFFFF"/>
+            <w:tcMar>
+              <w:top w:w="85" w:type="dxa"/>
+              <w:left w:w="85" w:type="dxa"/>
+              <w:bottom w:w="85" w:type="dxa"/>
+              <w:right w:w="85" w:type="dxa"/>
+            </w:tcMar>
+          </w:tcPr>
+          <w:p>
+            <w:pPr>
+              <w:pStyle w:val="DizeoCompacto"/>
+              <w:spacing w:after="60" w:before="40"/>
+              <w:jc w:val="left"/>
+            </w:pPr>
+            <w:r>
+              <w:rPr>
+                <w:rFonts w:ascii="Calibri" w:hAnsi="Calibri"/>
+                <w:b w:val="0"/>
+                <w:color w:val="000000"/>
+                <w:sz w:val="22"/>
+              </w:rPr>
+              <w:t>3 min 10 s</w:t>
             </w:r>
           </w:p>
         </w:tc>
@@ -5009,59 +5350,59 @@
         </w:tc>
         <w:tc>
           <w:tcPr>
-            <w:tcW w:type="dxa" w:w="5184"/>
-            <w:vAlign w:val="center"/>
-            <w:shd w:fill="FFFFFF"/>
-            <w:tcMar>
-              <w:top w:w="85" w:type="dxa"/>
-              <w:left w:w="85" w:type="dxa"/>
-              <w:bottom w:w="85" w:type="dxa"/>
-              <w:right w:w="85" w:type="dxa"/>
-            </w:tcMar>
-          </w:tcPr>
-          <w:p>
-            <w:pPr>
-              <w:pStyle w:val="DizeoCompacto"/>
-              <w:spacing w:after="60" w:before="40"/>
-              <w:jc w:val="left"/>
-            </w:pPr>
-            <w:r>
-              <w:rPr>
-                <w:rFonts w:ascii="Calibri" w:hAnsi="Calibri"/>
-                <w:b w:val="0"/>
-                <w:color w:val="000000"/>
-                <w:sz w:val="22"/>
-              </w:rPr>
-              <w:t>UML; alternativas y comparación de complejidad.</w:t>
-            </w:r>
-          </w:p>
-        </w:tc>
-        <w:tc>
-          <w:tcPr>
-            <w:tcW w:type="dxa" w:w="1080"/>
-            <w:vAlign w:val="center"/>
-            <w:shd w:fill="FFFFFF"/>
-            <w:tcMar>
-              <w:top w:w="85" w:type="dxa"/>
-              <w:left w:w="85" w:type="dxa"/>
-              <w:bottom w:w="85" w:type="dxa"/>
-              <w:right w:w="85" w:type="dxa"/>
-            </w:tcMar>
-          </w:tcPr>
-          <w:p>
-            <w:pPr>
-              <w:pStyle w:val="DizeoCompacto"/>
-              <w:spacing w:after="60" w:before="40"/>
-              <w:jc w:val="left"/>
-            </w:pPr>
-            <w:r>
-              <w:rPr>
-                <w:rFonts w:ascii="Calibri" w:hAnsi="Calibri"/>
-                <w:b w:val="0"/>
-                <w:color w:val="000000"/>
-                <w:sz w:val="22"/>
-              </w:rPr>
-              <w:t>3 min</w:t>
+            <w:tcW w:type="dxa" w:w="4824"/>
+            <w:vAlign w:val="center"/>
+            <w:shd w:fill="FFFFFF"/>
+            <w:tcMar>
+              <w:top w:w="85" w:type="dxa"/>
+              <w:left w:w="85" w:type="dxa"/>
+              <w:bottom w:w="85" w:type="dxa"/>
+              <w:right w:w="85" w:type="dxa"/>
+            </w:tcMar>
+          </w:tcPr>
+          <w:p>
+            <w:pPr>
+              <w:pStyle w:val="DizeoCompacto"/>
+              <w:spacing w:after="60" w:before="40"/>
+              <w:jc w:val="left"/>
+            </w:pPr>
+            <w:r>
+              <w:rPr>
+                <w:rFonts w:ascii="Calibri" w:hAnsi="Calibri"/>
+                <w:b w:val="0"/>
+                <w:color w:val="000000"/>
+                <w:sz w:val="22"/>
+              </w:rPr>
+              <w:t>UML, GestorPrioridades, alternativas y complejidad.</w:t>
+            </w:r>
+          </w:p>
+        </w:tc>
+        <w:tc>
+          <w:tcPr>
+            <w:tcW w:type="dxa" w:w="1440"/>
+            <w:vAlign w:val="center"/>
+            <w:shd w:fill="FFFFFF"/>
+            <w:tcMar>
+              <w:top w:w="85" w:type="dxa"/>
+              <w:left w:w="85" w:type="dxa"/>
+              <w:bottom w:w="85" w:type="dxa"/>
+              <w:right w:w="85" w:type="dxa"/>
+            </w:tcMar>
+          </w:tcPr>
+          <w:p>
+            <w:pPr>
+              <w:pStyle w:val="DizeoCompacto"/>
+              <w:spacing w:after="60" w:before="40"/>
+              <w:jc w:val="left"/>
+            </w:pPr>
+            <w:r>
+              <w:rPr>
+                <w:rFonts w:ascii="Calibri" w:hAnsi="Calibri"/>
+                <w:b w:val="0"/>
+                <w:color w:val="000000"/>
+                <w:sz w:val="22"/>
+              </w:rPr>
+              <w:t>3 min 10 s</w:t>
             </w:r>
           </w:p>
         </w:tc>
@@ -5202,6 +5543,7 @@
     <w:sectPr>
       <w:headerReference w:type="default" r:id="rId17"/>
       <w:footerReference w:type="default" r:id="rId18"/>
+      <w:headerReference w:type="first" r:id="rId23"/>
       <w:pgSz w:w="11906" w:h="16838"/>
       <w:pgMar w:top="1440" w:right="1841" w:bottom="1440" w:left="1797" w:header="709" w:footer="709" w:gutter="0"/>
       <w:pgBorders w:display="firstPage" w:offsetFrom="page">
@@ -5344,7 +5686,6 @@
               <w:szCs w:val="16"/>
               <w:lang w:val="es-ES_tradnl"/>
             </w:rPr>
-            <w:fldChar w:fldCharType="begin"/>
           </w:r>
           <w:r>
             <w:rPr>
@@ -5354,7 +5695,6 @@
               <w:szCs w:val="16"/>
               <w:lang w:val="es-ES_tradnl"/>
             </w:rPr>
-            <w:instrText xml:space="preserve"> DATE  \@ "dd' de 'MMMM' de 'yyyy" </w:instrText>
           </w:r>
           <w:r>
             <w:rPr>
@@ -5364,7 +5704,6 @@
               <w:szCs w:val="16"/>
               <w:lang w:val="es-ES_tradnl"/>
             </w:rPr>
-            <w:fldChar w:fldCharType="separate"/>
           </w:r>
           <w:r>
             <w:rPr>
@@ -5385,7 +5724,6 @@
               <w:szCs w:val="16"/>
               <w:lang w:val="es-ES_tradnl"/>
             </w:rPr>
-            <w:fldChar w:fldCharType="end"/>
           </w:r>
         </w:p>
       </w:tc>
@@ -5538,6 +5876,16 @@
         <w:szCs w:val="16"/>
         <w:u w:val="single"/>
       </w:rPr>
+    </w:pPr>
+  </w:p>
+</w:hdr>
+</file>
+
+<file path=word/header2.xml><?xml version="1.0" encoding="utf-8"?>
+<w:hdr xmlns:m="http://schemas.openxmlformats.org/officeDocument/2006/math" xmlns:mc="http://schemas.openxmlformats.org/markup-compatibility/2006" xmlns:mo="http://schemas.microsoft.com/office/mac/office/2008/main" xmlns:mv="urn:schemas-microsoft-com:mac:vml" xmlns:o="urn:schemas-microsoft-com:office:office" xmlns:r="http://schemas.openxmlformats.org/officeDocument/2006/relationships" xmlns:v="urn:schemas-microsoft-com:vml" xmlns:w10="urn:schemas-microsoft-com:office:word" xmlns:w14="http://schemas.microsoft.com/office/word/2010/wordml" xmlns:w="http://schemas.openxmlformats.org/wordprocessingml/2006/main" xmlns:wne="http://schemas.microsoft.com/office/word/2006/wordml" xmlns:wp14="http://schemas.microsoft.com/office/word/2010/wordprocessingDrawing" xmlns:wp="http://schemas.openxmlformats.org/drawingml/2006/wordprocessingDrawing" xmlns:wpc="http://schemas.microsoft.com/office/word/2010/wordprocessingCanvas" xmlns:wpg="http://schemas.microsoft.com/office/word/2010/wordprocessingGroup" xmlns:wpi="http://schemas.microsoft.com/office/word/2010/wordprocessingInk" xmlns:wps="http://schemas.microsoft.com/office/word/2010/wordprocessingShape" mc:Ignorable="w14 wp14">
+  <w:p>
+    <w:pPr>
+      <w:pStyle w:val="Header"/>
     </w:pPr>
   </w:p>
 </w:hdr>

</xml_diff>